<commit_message>
Resolve domain: innovationconsult.co.za, not .com
Human confirmed the registered domain is innovationconsult.co.za. The
letterhead canvas printed .com throughout (design-tool filler, not the
real domain). Updated tools/docgen/build-docs.js's COMPANY.email/web,
docs/innovation-consult-brand.md, and regenerated all three .docx
deliverables. Re-verified: XSD-valid, no .com text remaining in any of
the three documents.

Co-Authored-By: Claude Sonnet 5 <noreply@anthropic.com>
Claude-Session: https://claude.ai/code/session_01UGj9xUzCTUEQ54QmsH2hQt
</commit_message>
<xml_diff>
--- a/election-cos-app/docs/app-user-guide.docx
+++ b/election-cos-app/docs/app-user-guide.docx
@@ -920,7 +920,7 @@
           <w:sz w:val="22"/>
           <w:szCs w:val="22"/>
         </w:rPr>
-        <w:t xml:space="preserve">Contact your Party HQ Admin for account and permissions issues. For platform issues, contact info@innovationconsult.com.</w:t>
+        <w:t xml:space="preserve">Contact your Party HQ Admin for account and permissions issues. For platform issues, contact info@innovationconsult.co.za.</w:t>
       </w:r>
     </w:p>
     <w:p>
@@ -1090,7 +1090,7 @@
           <w:sz w:val="16"/>
           <w:szCs w:val="16"/>
         </w:rPr>
-        <w:t xml:space="preserve">P.O. Box 2590, Potchefstroom, 2520, N.W. Province, South Africa  |  +27 (0)67 907 1580  |  info@innovationconsult.com  |  www.innovationconsult.com</w:t>
+        <w:t xml:space="preserve">P.O. Box 2590, Potchefstroom, 2520, N.W. Province, South Africa  |  +27 (0)67 907 1580  |  info@innovationconsult.co.za  |  www.innovationconsult.co.za</w:t>
       </w:r>
     </w:p>
     <w:sectPr>

</xml_diff>